<commit_message>
Replace demo app with React frontend, add clause-level scoring and docs
- React + Vite frontend with design tokens, dark mode and mobile layout
- Python API (app/api.py) and prediction pipeline module (app/pipeline.py)
- Clause-level mixed/neutral score with 5 bands
- README rewritten: pipeline, NLP stages, improvements, limitations
- STEPS.md run guide; slimmer requirements.txt

Co-Authored-By: Claude Opus 5.5 <noreply@anthropic.com>
</commit_message>
<xml_diff>
--- a/reports/Sentiment_Analysis_Report.docx
+++ b/reports/Sentiment_Analysis_Report.docx
@@ -2692,7 +2692,7 @@
         <w:jc w:val="both"/>
       </w:pPr>
       <w:r>
-        <w:t xml:space="preserve">The TF-IDF + Logistic Regression model is small, fast and well-calibrated, so it is ideal to deploy. It is serialised with joblib and served through an interactive Streamlit app: a user types or pastes a review and instantly sees a positive/negative prediction with a confidence score and a few built-in examples.</w:t>
+        <w:t xml:space="preserve">The TF-IDF + Logistic Regression model is small, fast and well-calibrated, so it is ideal to deploy. It is serialised with joblib and served through an interactive React web app backed by a small Python API: a user types or pastes a review and instantly sees the verdict, with each part of the review highlighted by its own sentiment score, plus a few built-in samples.</w:t>
       </w:r>
     </w:p>
     <w:p>
@@ -2701,7 +2701,7 @@
         <w:jc w:val="both"/>
       </w:pPr>
       <w:r>
-        <w:t xml:space="preserve">Spot checks behave exactly as expected — a glowing review scores ~0.99 positive, a scathing one ~0.00, and a genuinely mixed review lands near the decision boundary. The app runs locally with one command and deploys free on Streamlit Community Cloud (see the project's STEPS guide).</w:t>
+        <w:t xml:space="preserve">Spot checks behave exactly as expected — a glowing review scores ~0.99 positive, a scathing one ~0.00, and a genuinely mixed review lands near the decision boundary. The app runs locally with one command (see the project's STEPS guide).</w:t>
       </w:r>
     </w:p>
     <w:p>

</xml_diff>